<commit_message>
Phase 2 LLM walk-forward 결과 + 비교 차트 + brief 갱신
Walk-forward Phase 2 (CMA judge LLM, 2018-2026 lock70 IPS) 완료:
  Sharpe 1.204 (baseline 1.195 +0.7%), σ 9.26% (-7bp),
  MDD -21.56%, total 133.00%, turnover 5.70% (vs 5.52%)

ROI 결론: lock70이 ensemble 자유도를 좁혀 LLM 영향력 미미.
Production은 baseline 추천 (결정적, API cost 0). LLM은 신뢰성 보강용.

신규 산출물:
  outputs/backtest_kr_lock70_llm_phase2/* — Phase 2 메트릭/NAV/weights
  docs/lock70_nav_comparison.png — 3-line NAV 비교 (baseline/Phase 2/BM)
  scripts/make_comparison_chart.py — 비교 차트 생성기

브리핑 docx에 §9 Phase 2 행 + ROI 결론 + 차트 임베드 추가.
.gitignore: phase2/quarters/ 와 quarter_runs.jsonl 만 제외 (메트릭은 유지).

Co-Authored-By: Claude Opus 4.7 (1M context) <noreply@anthropic.com>
</commit_message>
<xml_diff>
--- a/docs/production_brief_kr_pension_saa.docx
+++ b/docs/production_brief_kr_pension_saa.docx
@@ -6200,7 +6200,7 @@
         </w:tc>
         <w:tc>
           <w:tcPr>
-            <w:tcW w:type="dxa" w:w="2551"/>
+            <w:tcW w:type="dxa" w:w="2268"/>
             <w:shd w:val="clear" w:fill="1F4E79"/>
           </w:tcPr>
           <w:p>
@@ -6216,7 +6216,29 @@
                 <w:sz w:val="20"/>
                 <w:rFonts w:eastAsia="Malgun Gothic" w:ascii="Malgun Gothic" w:hAnsi="Malgun Gothic"/>
               </w:rPr>
-              <w:t>AI 자율 (lock70)</w:t>
+              <w:t>AI baseline ★</w:t>
+            </w:r>
+          </w:p>
+        </w:tc>
+        <w:tc>
+          <w:tcPr>
+            <w:tcW w:type="dxa" w:w="2268"/>
+            <w:shd w:val="clear" w:fill="1F4E79"/>
+          </w:tcPr>
+          <w:p>
+            <w:pPr>
+              <w:jc w:val="center"/>
+            </w:pPr>
+            <w:r/>
+            <w:r>
+              <w:rPr>
+                <w:rFonts w:ascii="Malgun Gothic" w:hAnsi="Malgun Gothic"/>
+                <w:b/>
+                <w:color w:val="FFFFFF"/>
+                <w:sz w:val="20"/>
+                <w:rFonts w:eastAsia="Malgun Gothic" w:ascii="Malgun Gothic" w:hAnsi="Malgun Gothic"/>
+              </w:rPr>
+              <w:t>AI Phase 2 LLM</w:t>
             </w:r>
           </w:p>
         </w:tc>
@@ -6239,28 +6261,6 @@
                 <w:rFonts w:eastAsia="Malgun Gothic" w:ascii="Malgun Gothic" w:hAnsi="Malgun Gothic"/>
               </w:rPr>
               <w:t>KR 60/40 BM</w:t>
-            </w:r>
-          </w:p>
-        </w:tc>
-        <w:tc>
-          <w:tcPr>
-            <w:tcW w:type="dxa" w:w="2268"/>
-            <w:shd w:val="clear" w:fill="1F4E79"/>
-          </w:tcPr>
-          <w:p>
-            <w:pPr>
-              <w:jc w:val="center"/>
-            </w:pPr>
-            <w:r/>
-            <w:r>
-              <w:rPr>
-                <w:rFonts w:ascii="Malgun Gothic" w:hAnsi="Malgun Gothic"/>
-                <w:b/>
-                <w:color w:val="FFFFFF"/>
-                <w:sz w:val="20"/>
-                <w:rFonts w:eastAsia="Malgun Gothic" w:ascii="Malgun Gothic" w:hAnsi="Malgun Gothic"/>
-              </w:rPr>
-              <w:t>차이</w:t>
             </w:r>
           </w:p>
         </w:tc>
@@ -6288,7 +6288,27 @@
         </w:tc>
         <w:tc>
           <w:tcPr>
-            <w:tcW w:type="dxa" w:w="2551"/>
+            <w:tcW w:type="dxa" w:w="2268"/>
+          </w:tcPr>
+          <w:p>
+            <w:pPr>
+              <w:spacing w:after="0"/>
+            </w:pPr>
+            <w:r/>
+            <w:r>
+              <w:rPr>
+                <w:rFonts w:ascii="Malgun Gothic" w:hAnsi="Malgun Gothic"/>
+                <w:b w:val="0"/>
+                <w:sz w:val="19"/>
+                <w:rFonts w:eastAsia="Malgun Gothic" w:ascii="Malgun Gothic" w:hAnsi="Malgun Gothic"/>
+              </w:rPr>
+              <w:t>11.15%</w:t>
+            </w:r>
+          </w:p>
+        </w:tc>
+        <w:tc>
+          <w:tcPr>
+            <w:tcW w:type="dxa" w:w="2268"/>
           </w:tcPr>
           <w:p>
             <w:pPr>
@@ -6326,26 +6346,6 @@
             </w:r>
           </w:p>
         </w:tc>
-        <w:tc>
-          <w:tcPr>
-            <w:tcW w:type="dxa" w:w="2268"/>
-          </w:tcPr>
-          <w:p>
-            <w:pPr>
-              <w:spacing w:after="0"/>
-            </w:pPr>
-            <w:r/>
-            <w:r>
-              <w:rPr>
-                <w:rFonts w:ascii="Malgun Gothic" w:hAnsi="Malgun Gothic"/>
-                <w:b w:val="0"/>
-                <w:sz w:val="19"/>
-                <w:rFonts w:eastAsia="Malgun Gothic" w:ascii="Malgun Gothic" w:hAnsi="Malgun Gothic"/>
-              </w:rPr>
-              <w:t>-1.67%p</w:t>
-            </w:r>
-          </w:p>
-        </w:tc>
       </w:tr>
       <w:tr>
         <w:tc>
@@ -6370,7 +6370,7 @@
         </w:tc>
         <w:tc>
           <w:tcPr>
-            <w:tcW w:type="dxa" w:w="2551"/>
+            <w:tcW w:type="dxa" w:w="2268"/>
           </w:tcPr>
           <w:p>
             <w:pPr>
@@ -6404,7 +6404,7 @@
                 <w:sz w:val="19"/>
                 <w:rFonts w:eastAsia="Malgun Gothic" w:ascii="Malgun Gothic" w:hAnsi="Malgun Gothic"/>
               </w:rPr>
-              <w:t>13.79%</w:t>
+              <w:t>9.26%</w:t>
             </w:r>
           </w:p>
         </w:tc>
@@ -6424,7 +6424,7 @@
                 <w:sz w:val="19"/>
                 <w:rFonts w:eastAsia="Malgun Gothic" w:ascii="Malgun Gothic" w:hAnsi="Malgun Gothic"/>
               </w:rPr>
-              <w:t>-4.46%p (32% 낮음)</w:t>
+              <w:t>13.79%</w:t>
             </w:r>
           </w:p>
         </w:tc>
@@ -6452,7 +6452,7 @@
         </w:tc>
         <w:tc>
           <w:tcPr>
-            <w:tcW w:type="dxa" w:w="2551"/>
+            <w:tcW w:type="dxa" w:w="2268"/>
           </w:tcPr>
           <w:p>
             <w:pPr>
@@ -6486,7 +6486,7 @@
                 <w:sz w:val="19"/>
                 <w:rFonts w:eastAsia="Malgun Gothic" w:ascii="Malgun Gothic" w:hAnsi="Malgun Gothic"/>
               </w:rPr>
-              <w:t>0.929</w:t>
+              <w:t>1.204</w:t>
             </w:r>
           </w:p>
         </w:tc>
@@ -6506,7 +6506,7 @@
                 <w:sz w:val="19"/>
                 <w:rFonts w:eastAsia="Malgun Gothic" w:ascii="Malgun Gothic" w:hAnsi="Malgun Gothic"/>
               </w:rPr>
-              <w:t>+0.266 (29% 높음)</w:t>
+              <w:t>0.929</w:t>
             </w:r>
           </w:p>
         </w:tc>
@@ -6534,7 +6534,7 @@
         </w:tc>
         <w:tc>
           <w:tcPr>
-            <w:tcW w:type="dxa" w:w="2551"/>
+            <w:tcW w:type="dxa" w:w="2268"/>
           </w:tcPr>
           <w:p>
             <w:pPr>
@@ -6568,7 +6568,7 @@
                 <w:sz w:val="19"/>
                 <w:rFonts w:eastAsia="Malgun Gothic" w:ascii="Malgun Gothic" w:hAnsi="Malgun Gothic"/>
               </w:rPr>
-              <w:t>-26.73%</w:t>
+              <w:t>-21.56%</w:t>
             </w:r>
           </w:p>
         </w:tc>
@@ -6588,7 +6588,7 @@
                 <w:sz w:val="19"/>
                 <w:rFonts w:eastAsia="Malgun Gothic" w:ascii="Malgun Gothic" w:hAnsi="Malgun Gothic"/>
               </w:rPr>
-              <w:t>+5.16%p (양호)</w:t>
+              <w:t>-26.73%</w:t>
             </w:r>
           </w:p>
         </w:tc>
@@ -6616,7 +6616,7 @@
         </w:tc>
         <w:tc>
           <w:tcPr>
-            <w:tcW w:type="dxa" w:w="2551"/>
+            <w:tcW w:type="dxa" w:w="2268"/>
           </w:tcPr>
           <w:p>
             <w:pPr>
@@ -6650,7 +6650,7 @@
                 <w:sz w:val="19"/>
                 <w:rFonts w:eastAsia="Malgun Gothic" w:ascii="Malgun Gothic" w:hAnsi="Malgun Gothic"/>
               </w:rPr>
-              <w:t>152.58%</w:t>
+              <w:t>133.00%</w:t>
             </w:r>
           </w:p>
         </w:tc>
@@ -6670,7 +6670,7 @@
                 <w:sz w:val="19"/>
                 <w:rFonts w:eastAsia="Malgun Gothic" w:ascii="Malgun Gothic" w:hAnsi="Malgun Gothic"/>
               </w:rPr>
-              <w:t>-19.7%p</w:t>
+              <w:t>152.58%</w:t>
             </w:r>
           </w:p>
         </w:tc>
@@ -6692,13 +6692,13 @@
                 <w:sz w:val="19"/>
                 <w:rFonts w:eastAsia="Malgun Gothic" w:ascii="Malgun Gothic" w:hAnsi="Malgun Gothic"/>
               </w:rPr>
-              <w:t>거래 비용</w:t>
+              <w:t>거래 비용 (누적)</w:t>
             </w:r>
           </w:p>
         </w:tc>
         <w:tc>
           <w:tcPr>
-            <w:tcW w:type="dxa" w:w="2551"/>
+            <w:tcW w:type="dxa" w:w="2268"/>
           </w:tcPr>
           <w:p>
             <w:pPr>
@@ -6712,7 +6712,27 @@
                 <w:sz w:val="19"/>
                 <w:rFonts w:eastAsia="Malgun Gothic" w:ascii="Malgun Gothic" w:hAnsi="Malgun Gothic"/>
               </w:rPr>
-              <w:t>9 bp 누적</w:t>
+              <w:t>9 bp</w:t>
+            </w:r>
+          </w:p>
+        </w:tc>
+        <w:tc>
+          <w:tcPr>
+            <w:tcW w:type="dxa" w:w="2268"/>
+          </w:tcPr>
+          <w:p>
+            <w:pPr>
+              <w:spacing w:after="0"/>
+            </w:pPr>
+            <w:r/>
+            <w:r>
+              <w:rPr>
+                <w:rFonts w:ascii="Malgun Gothic" w:hAnsi="Malgun Gothic"/>
+                <w:b w:val="0"/>
+                <w:sz w:val="19"/>
+                <w:rFonts w:eastAsia="Malgun Gothic" w:ascii="Malgun Gothic" w:hAnsi="Malgun Gothic"/>
+              </w:rPr>
+              <w:t>10 bp</w:t>
             </w:r>
           </w:p>
         </w:tc>
@@ -6733,6 +6753,68 @@
                 <w:rFonts w:eastAsia="Malgun Gothic" w:ascii="Malgun Gothic" w:hAnsi="Malgun Gothic"/>
               </w:rPr>
               <w:t>—</w:t>
+            </w:r>
+          </w:p>
+        </w:tc>
+      </w:tr>
+      <w:tr>
+        <w:tc>
+          <w:tcPr>
+            <w:tcW w:type="dxa" w:w="1984"/>
+          </w:tcPr>
+          <w:p>
+            <w:pPr>
+              <w:spacing w:after="0"/>
+            </w:pPr>
+            <w:r/>
+            <w:r>
+              <w:rPr>
+                <w:rFonts w:ascii="Malgun Gothic" w:hAnsi="Malgun Gothic"/>
+                <w:b w:val="0"/>
+                <w:sz w:val="19"/>
+                <w:rFonts w:eastAsia="Malgun Gothic" w:ascii="Malgun Gothic" w:hAnsi="Malgun Gothic"/>
+              </w:rPr>
+              <w:t>분기당 평균 턴오버</w:t>
+            </w:r>
+          </w:p>
+        </w:tc>
+        <w:tc>
+          <w:tcPr>
+            <w:tcW w:type="dxa" w:w="2268"/>
+          </w:tcPr>
+          <w:p>
+            <w:pPr>
+              <w:spacing w:after="0"/>
+            </w:pPr>
+            <w:r/>
+            <w:r>
+              <w:rPr>
+                <w:rFonts w:ascii="Malgun Gothic" w:hAnsi="Malgun Gothic"/>
+                <w:b w:val="0"/>
+                <w:sz w:val="19"/>
+                <w:rFonts w:eastAsia="Malgun Gothic" w:ascii="Malgun Gothic" w:hAnsi="Malgun Gothic"/>
+              </w:rPr>
+              <w:t>5.52%</w:t>
+            </w:r>
+          </w:p>
+        </w:tc>
+        <w:tc>
+          <w:tcPr>
+            <w:tcW w:type="dxa" w:w="2268"/>
+          </w:tcPr>
+          <w:p>
+            <w:pPr>
+              <w:spacing w:after="0"/>
+            </w:pPr>
+            <w:r/>
+            <w:r>
+              <w:rPr>
+                <w:rFonts w:ascii="Malgun Gothic" w:hAnsi="Malgun Gothic"/>
+                <w:b w:val="0"/>
+                <w:sz w:val="19"/>
+                <w:rFonts w:eastAsia="Malgun Gothic" w:ascii="Malgun Gothic" w:hAnsi="Malgun Gothic"/>
+              </w:rPr>
+              <w:t>5.70%</w:t>
             </w:r>
           </w:p>
         </w:tc>
@@ -6772,7 +6854,172 @@
           <w:sz w:val="20"/>
           <w:rFonts w:eastAsia="Malgun Gothic" w:ascii="Malgun Gothic" w:hAnsi="Malgun Gothic"/>
         </w:rPr>
+        <w:t>▸ ★ 영상에는 baseline 수치(Sharpe 1.195)를 사용하세요 — production 운영 기준이며, Phase 2 대비 turnover/비용이 낮습니다. Phase 2 결과는 'LLM Phase 2까지 검증한 데이터'라는 *기술 신뢰성* 메시지로만 활용 가능.</w:t>
+      </w:r>
+    </w:p>
+    <w:p>
+      <w:pPr>
+        <w:spacing w:after="120"/>
+        <w:ind w:left="283"/>
+      </w:pPr>
+      <w:r>
+        <w:rPr>
+          <w:rFonts w:ascii="Malgun Gothic" w:hAnsi="Malgun Gothic"/>
+          <w:b/>
+          <w:color w:val="C89B3C"/>
+          <w:sz w:val="20"/>
+          <w:rFonts w:eastAsia="Malgun Gothic" w:ascii="Malgun Gothic" w:hAnsi="Malgun Gothic"/>
+        </w:rPr>
         <w:t>▸ 핵심 메시지: 'AI 자율은 BM 대비 변동성을 32% 낮추면서 Sharpe를 29% 높입니다.' 이 한 줄이 Result 막의 narration이어야 합니다.</w:t>
+      </w:r>
+    </w:p>
+    <w:p>
+      <w:pPr>
+        <w:jc w:val="center"/>
+      </w:pPr>
+      <w:r>
+        <w:drawing>
+          <wp:inline xmlns:a="http://schemas.openxmlformats.org/drawingml/2006/main" xmlns:pic="http://schemas.openxmlformats.org/drawingml/2006/picture">
+            <wp:extent cx="5580000" cy="2942182"/>
+            <wp:docPr id="1" name="Picture 1"/>
+            <wp:cNvGraphicFramePr>
+              <a:graphicFrameLocks noChangeAspect="1"/>
+            </wp:cNvGraphicFramePr>
+            <a:graphic>
+              <a:graphicData uri="http://schemas.openxmlformats.org/drawingml/2006/picture">
+                <pic:pic>
+                  <pic:nvPicPr>
+                    <pic:cNvPr id="0" name="lock70_nav_comparison.png"/>
+                    <pic:cNvPicPr/>
+                  </pic:nvPicPr>
+                  <pic:blipFill>
+                    <a:blip r:embed="rId9"/>
+                    <a:stretch>
+                      <a:fillRect/>
+                    </a:stretch>
+                  </pic:blipFill>
+                  <pic:spPr>
+                    <a:xfrm>
+                      <a:off x="0" y="0"/>
+                      <a:ext cx="5580000" cy="2942182"/>
+                    </a:xfrm>
+                    <a:prstGeom prst="rect"/>
+                  </pic:spPr>
+                </pic:pic>
+              </a:graphicData>
+            </a:graphic>
+          </wp:inline>
+        </w:drawing>
+      </w:r>
+    </w:p>
+    <w:p>
+      <w:pPr>
+        <w:jc w:val="center"/>
+      </w:pPr>
+      <w:r>
+        <w:rPr>
+          <w:rFonts w:ascii="Malgun Gothic" w:hAnsi="Malgun Gothic"/>
+          <w:b w:val="0"/>
+          <w:color w:val="555555"/>
+          <w:sz w:val="18"/>
+          <w:rFonts w:eastAsia="Malgun Gothic" w:ascii="Malgun Gothic" w:hAnsi="Malgun Gothic"/>
+        </w:rPr>
+        <w:t>[ 그림: 3-line NAV 비교 — baseline / Phase 2 LLM / KR 60/40 BM ]</w:t>
+      </w:r>
+    </w:p>
+    <w:p>
+      <w:pPr>
+        <w:spacing w:before="240" w:after="80"/>
+      </w:pPr>
+      <w:r>
+        <w:rPr>
+          <w:rFonts w:ascii="Malgun Gothic" w:hAnsi="Malgun Gothic"/>
+          <w:b/>
+          <w:color w:val="1F4E79"/>
+          <w:sz w:val="26"/>
+          <w:rFonts w:eastAsia="Malgun Gothic" w:ascii="Malgun Gothic" w:hAnsi="Malgun Gothic"/>
+        </w:rPr>
+        <w:t>LLM Phase 2의 가치 — Why baseline은 충분한가</w:t>
+      </w:r>
+    </w:p>
+    <w:p>
+      <w:pPr>
+        <w:pStyle w:val="ListBullet"/>
+        <w:spacing w:after="40"/>
+        <w:ind w:left="283"/>
+      </w:pPr>
+      <w:r>
+        <w:rPr>
+          <w:rFonts w:ascii="Malgun Gothic" w:hAnsi="Malgun Gothic"/>
+          <w:b w:val="0"/>
+          <w:sz w:val="20"/>
+          <w:rFonts w:eastAsia="Malgun Gothic" w:ascii="Malgun Gothic" w:hAnsi="Malgun Gothic"/>
+        </w:rPr>
+        <w:t>한국에서 LLM의 부가가치는 매우 작음 — Phase 1 검증 (2026-05-01) 동일 결론, lock70 + Phase 2 (2026-05-10) 재확인.</w:t>
+      </w:r>
+    </w:p>
+    <w:p>
+      <w:pPr>
+        <w:pStyle w:val="ListBullet"/>
+        <w:spacing w:after="40"/>
+        <w:ind w:left="283"/>
+      </w:pPr>
+      <w:r>
+        <w:rPr>
+          <w:rFonts w:ascii="Malgun Gothic" w:hAnsi="Malgun Gothic"/>
+          <w:b w:val="0"/>
+          <w:sz w:val="20"/>
+          <w:rFonts w:eastAsia="Malgun Gothic" w:ascii="Malgun Gothic" w:hAnsi="Malgun Gothic"/>
+        </w:rPr>
+        <w:t>lock70 IPS가 ensemble 자유도를 좁힘 — 위험자산 70% 고정 상태에서 LLM은 카테고리 *내부* 분배만 다르게 가능.</w:t>
+      </w:r>
+    </w:p>
+    <w:p>
+      <w:pPr>
+        <w:pStyle w:val="ListBullet"/>
+        <w:spacing w:after="40"/>
+        <w:ind w:left="283"/>
+      </w:pPr>
+      <w:r>
+        <w:rPr>
+          <w:rFonts w:ascii="Malgun Gothic" w:hAnsi="Malgun Gothic"/>
+          <w:b w:val="0"/>
+          <w:sz w:val="20"/>
+          <w:rFonts w:eastAsia="Malgun Gothic" w:ascii="Malgun Gothic" w:hAnsi="Malgun Gothic"/>
+        </w:rPr>
+        <w:t>Phase 2 ROI 낮음: 분기당 ~$0.4 cost로 Sharpe +0.7% 개선 (1.195 → 1.204), σ -7bp. 통계적으로 noise 수준.</w:t>
+      </w:r>
+    </w:p>
+    <w:p>
+      <w:pPr>
+        <w:pStyle w:val="ListBullet"/>
+        <w:spacing w:after="40"/>
+        <w:ind w:left="283"/>
+      </w:pPr>
+      <w:r>
+        <w:rPr>
+          <w:rFonts w:ascii="Malgun Gothic" w:hAnsi="Malgun Gothic"/>
+          <w:b w:val="0"/>
+          <w:sz w:val="20"/>
+          <w:rFonts w:eastAsia="Malgun Gothic" w:ascii="Malgun Gothic" w:hAnsi="Malgun Gothic"/>
+        </w:rPr>
+        <w:t>Production 운영에는 baseline 추천: 결정적, API cost 0, 결과 거의 동일.</w:t>
+      </w:r>
+    </w:p>
+    <w:p>
+      <w:pPr>
+        <w:pStyle w:val="ListBullet"/>
+        <w:spacing w:after="40"/>
+        <w:ind w:left="283"/>
+      </w:pPr>
+      <w:r>
+        <w:rPr>
+          <w:rFonts w:ascii="Malgun Gothic" w:hAnsi="Malgun Gothic"/>
+          <w:b w:val="0"/>
+          <w:sz w:val="20"/>
+          <w:rFonts w:eastAsia="Malgun Gothic" w:ascii="Malgun Gothic" w:hAnsi="Malgun Gothic"/>
+        </w:rPr>
+        <w:t>LLM의 진짜 가치는 의사결정이 아닌 *설명*에 있음 — board memo, regime narrative, Q&amp;A.</w:t>
       </w:r>
     </w:p>
     <w:p>

</xml_diff>